<commit_message>
Publish Level 3 Lessons 2–13 lesson books, audio, and slides.
Copy the draft books into level3/curriculum, attach the recorded listening files, and rebuild the decks so the notes and credits use the real lengths.
</commit_message>
<xml_diff>
--- a/public/level3/downloads/Level3_Lesson1.docx
+++ b/public/level3/downloads/Level3_Lesson1.docx
@@ -35,7 +35,7 @@
           <w:i w:val="0"/>
           <w:sz w:val="22"/>
         </w:rPr>
-        <w:t xml:space="preserve"> Complete sample lesson (Lessons 2–13 are coming soon). Draft for review; not published.</w:t>
+        <w:t xml:space="preserve"> Complete sample lesson (all 13 Level 3 lessons are published).</w:t>
       </w:r>
     </w:p>
     <w:p>
@@ -15299,7 +15299,7 @@
         <w:gridCol w:w="2052"/>
         <w:gridCol w:w="316"/>
         <w:gridCol w:w="1503"/>
-        <w:gridCol w:w="3412"/>
+        <w:gridCol w:w="3413"/>
       </w:tblGrid>
       <w:tr>
         <w:trPr>

</xml_diff>